<commit_message>
Wokring on python and almost done
</commit_message>
<xml_diff>
--- a/python/p3_advanced_methods_of_python.docx
+++ b/python/p3_advanced_methods_of_python.docx
@@ -22,12 +22,178 @@
     </w:p>
     <w:p>
       <w:pPr>
-        <w:jc w:val="both"/>
-        <w:rPr>
-          <w:sz w:val="32"/>
-          <w:szCs w:val="32"/>
-        </w:rPr>
-      </w:pPr>
+        <w:pStyle w:val="ListParagraph"/>
+        <w:numPr>
+          <w:ilvl w:val="0"/>
+          <w:numId w:val="5"/>
+        </w:numPr>
+        <w:jc w:val="both"/>
+        <w:rPr>
+          <w:sz w:val="32"/>
+          <w:szCs w:val="32"/>
+        </w:rPr>
+      </w:pPr>
+      <w:proofErr w:type="gramStart"/>
+      <w:r>
+        <w:rPr>
+          <w:b/>
+          <w:bCs/>
+          <w:sz w:val="32"/>
+          <w:szCs w:val="32"/>
+        </w:rPr>
+        <w:t>map(</w:t>
+      </w:r>
+      <w:proofErr w:type="gramEnd"/>
+      <w:r>
+        <w:rPr>
+          <w:b/>
+          <w:bCs/>
+          <w:sz w:val="32"/>
+          <w:szCs w:val="32"/>
+        </w:rPr>
+        <w:t>)</w:t>
+      </w:r>
+      <w:r>
+        <w:rPr>
+          <w:sz w:val="32"/>
+          <w:szCs w:val="32"/>
+        </w:rPr>
+        <w:t xml:space="preserve"> Function (loop alternative)…………..…………..……………..2</w:t>
+      </w:r>
+    </w:p>
+    <w:p>
+      <w:pPr>
+        <w:pStyle w:val="ListParagraph"/>
+        <w:numPr>
+          <w:ilvl w:val="0"/>
+          <w:numId w:val="5"/>
+        </w:numPr>
+        <w:jc w:val="both"/>
+        <w:rPr>
+          <w:sz w:val="32"/>
+          <w:szCs w:val="32"/>
+        </w:rPr>
+      </w:pPr>
+      <w:proofErr w:type="gramStart"/>
+      <w:r>
+        <w:rPr>
+          <w:b/>
+          <w:bCs/>
+          <w:sz w:val="32"/>
+          <w:szCs w:val="32"/>
+        </w:rPr>
+        <w:t>filter(</w:t>
+      </w:r>
+      <w:proofErr w:type="gramEnd"/>
+      <w:r>
+        <w:rPr>
+          <w:b/>
+          <w:bCs/>
+          <w:sz w:val="32"/>
+          <w:szCs w:val="32"/>
+        </w:rPr>
+        <w:t xml:space="preserve">) </w:t>
+      </w:r>
+      <w:r>
+        <w:rPr>
+          <w:sz w:val="32"/>
+          <w:szCs w:val="32"/>
+        </w:rPr>
+        <w:t>Function………………………………………………………………4</w:t>
+      </w:r>
+    </w:p>
+    <w:p>
+      <w:pPr>
+        <w:pStyle w:val="ListParagraph"/>
+        <w:numPr>
+          <w:ilvl w:val="0"/>
+          <w:numId w:val="5"/>
+        </w:numPr>
+        <w:jc w:val="both"/>
+        <w:rPr>
+          <w:sz w:val="32"/>
+          <w:szCs w:val="32"/>
+        </w:rPr>
+      </w:pPr>
+      <w:proofErr w:type="gramStart"/>
+      <w:r>
+        <w:rPr>
+          <w:b/>
+          <w:bCs/>
+          <w:sz w:val="32"/>
+          <w:szCs w:val="32"/>
+        </w:rPr>
+        <w:t>reduce(</w:t>
+      </w:r>
+      <w:proofErr w:type="gramEnd"/>
+      <w:r>
+        <w:rPr>
+          <w:b/>
+          <w:bCs/>
+          <w:sz w:val="32"/>
+          <w:szCs w:val="32"/>
+        </w:rPr>
+        <w:t>)</w:t>
+      </w:r>
+      <w:r>
+        <w:rPr>
+          <w:sz w:val="32"/>
+          <w:szCs w:val="32"/>
+        </w:rPr>
+        <w:t xml:space="preserve"> Function…………………………………………………………..5</w:t>
+      </w:r>
+    </w:p>
+    <w:p>
+      <w:pPr>
+        <w:pStyle w:val="ListParagraph"/>
+        <w:numPr>
+          <w:ilvl w:val="0"/>
+          <w:numId w:val="5"/>
+        </w:numPr>
+        <w:jc w:val="both"/>
+        <w:rPr>
+          <w:sz w:val="32"/>
+          <w:szCs w:val="32"/>
+        </w:rPr>
+      </w:pPr>
+      <w:proofErr w:type="spellStart"/>
+      <w:proofErr w:type="gramStart"/>
+      <w:r>
+        <w:rPr>
+          <w:b/>
+          <w:bCs/>
+          <w:sz w:val="32"/>
+          <w:szCs w:val="32"/>
+        </w:rPr>
+        <w:t>divmod</w:t>
+      </w:r>
+      <w:proofErr w:type="spellEnd"/>
+      <w:r>
+        <w:rPr>
+          <w:b/>
+          <w:bCs/>
+          <w:sz w:val="32"/>
+          <w:szCs w:val="32"/>
+        </w:rPr>
+        <w:t>(</w:t>
+      </w:r>
+      <w:proofErr w:type="gramEnd"/>
+      <w:r>
+        <w:rPr>
+          <w:b/>
+          <w:bCs/>
+          <w:sz w:val="32"/>
+          <w:szCs w:val="32"/>
+        </w:rPr>
+        <w:t>)</w:t>
+      </w:r>
+      <w:r>
+        <w:rPr>
+          <w:sz w:val="32"/>
+          <w:szCs w:val="32"/>
+        </w:rPr>
+        <w:t xml:space="preserve"> Function…………………………………………………………..6</w:t>
+      </w:r>
     </w:p>
     <w:p>
       <w:pPr>
@@ -92,7 +258,25 @@
           <w:sz w:val="32"/>
           <w:szCs w:val="32"/>
         </w:rPr>
-        <w:t>) method (Loop Alternative):</w:t>
+        <w:t>)</w:t>
+      </w:r>
+      <w:r>
+        <w:rPr>
+          <w:b/>
+          <w:bCs/>
+          <w:sz w:val="32"/>
+          <w:szCs w:val="32"/>
+        </w:rPr>
+        <w:t xml:space="preserve"> Function</w:t>
+      </w:r>
+      <w:r>
+        <w:rPr>
+          <w:b/>
+          <w:bCs/>
+          <w:sz w:val="32"/>
+          <w:szCs w:val="32"/>
+        </w:rPr>
+        <w:t xml:space="preserve"> (Loop Alternative):</w:t>
       </w:r>
     </w:p>
     <w:p>
@@ -540,27 +724,7 @@
           <w:sz w:val="32"/>
           <w:szCs w:val="32"/>
         </w:rPr>
-        <w:t>print(result)</w:t>
-      </w:r>
-      <w:r>
-        <w:rPr>
-          <w:b/>
-          <w:bCs/>
-          <w:color w:val="D86DCB" w:themeColor="accent5" w:themeTint="99"/>
-          <w:sz w:val="32"/>
-          <w:szCs w:val="32"/>
-        </w:rPr>
-        <w:t xml:space="preserve"> # </w:t>
-      </w:r>
-      <w:r>
-        <w:rPr>
-          <w:b/>
-          <w:bCs/>
-          <w:color w:val="D86DCB" w:themeColor="accent5" w:themeTint="99"/>
-          <w:sz w:val="32"/>
-          <w:szCs w:val="32"/>
-        </w:rPr>
-        <w:t>&lt;map object at 0x...&gt;</w:t>
+        <w:t>print(result) # &lt;map object at 0x...&gt;</w:t>
       </w:r>
     </w:p>
     <w:p>
@@ -628,17 +792,7 @@
           <w:sz w:val="32"/>
           <w:szCs w:val="32"/>
         </w:rPr>
-        <w:t xml:space="preserve">print(result) # </w:t>
-      </w:r>
-      <w:r>
-        <w:rPr>
-          <w:b/>
-          <w:bCs/>
-          <w:color w:val="D86DCB" w:themeColor="accent5" w:themeTint="99"/>
-          <w:sz w:val="32"/>
-          <w:szCs w:val="32"/>
-        </w:rPr>
-        <w:t>[1, 4, 9, 16]</w:t>
+        <w:t>print(result) # [1, 4, 9, 16]</w:t>
       </w:r>
     </w:p>
     <w:p>
@@ -835,27 +989,7 @@
           <w:sz w:val="32"/>
           <w:szCs w:val="32"/>
         </w:rPr>
-        <w:t>print(result)</w:t>
-      </w:r>
-      <w:r>
-        <w:rPr>
-          <w:b/>
-          <w:bCs/>
-          <w:color w:val="D86DCB" w:themeColor="accent5" w:themeTint="99"/>
-          <w:sz w:val="32"/>
-          <w:szCs w:val="32"/>
-        </w:rPr>
-        <w:t xml:space="preserve"> # </w:t>
-      </w:r>
-      <w:r>
-        <w:rPr>
-          <w:b/>
-          <w:bCs/>
-          <w:color w:val="D86DCB" w:themeColor="accent5" w:themeTint="99"/>
-          <w:sz w:val="32"/>
-          <w:szCs w:val="32"/>
-        </w:rPr>
-        <w:t>[1, 4, 9, 16]</w:t>
+        <w:t>print(result) # [1, 4, 9, 16]</w:t>
       </w:r>
     </w:p>
     <w:p>
@@ -1193,27 +1327,7 @@
           <w:sz w:val="32"/>
           <w:szCs w:val="32"/>
         </w:rPr>
-        <w:t>print(result)</w:t>
-      </w:r>
-      <w:r>
-        <w:rPr>
-          <w:b/>
-          <w:bCs/>
-          <w:color w:val="D86DCB" w:themeColor="accent5" w:themeTint="99"/>
-          <w:sz w:val="32"/>
-          <w:szCs w:val="32"/>
-        </w:rPr>
-        <w:t xml:space="preserve"> # </w:t>
-      </w:r>
-      <w:r>
-        <w:rPr>
-          <w:b/>
-          <w:bCs/>
-          <w:color w:val="D86DCB" w:themeColor="accent5" w:themeTint="99"/>
-          <w:sz w:val="32"/>
-          <w:szCs w:val="32"/>
-        </w:rPr>
-        <w:t>['ALICE', 'BOB', 'CHARLIE']</w:t>
+        <w:t>print(result) # ['ALICE', 'BOB', 'CHARLIE']</w:t>
       </w:r>
     </w:p>
     <w:p>
@@ -1540,27 +1654,7 @@
           <w:sz w:val="32"/>
           <w:szCs w:val="32"/>
         </w:rPr>
-        <w:t>print(result)</w:t>
-      </w:r>
-      <w:r>
-        <w:rPr>
-          <w:b/>
-          <w:bCs/>
-          <w:color w:val="D86DCB" w:themeColor="accent5" w:themeTint="99"/>
-          <w:sz w:val="32"/>
-          <w:szCs w:val="32"/>
-        </w:rPr>
-        <w:t xml:space="preserve"> # </w:t>
-      </w:r>
-      <w:r>
-        <w:rPr>
-          <w:b/>
-          <w:bCs/>
-          <w:color w:val="D86DCB" w:themeColor="accent5" w:themeTint="99"/>
-          <w:sz w:val="32"/>
-          <w:szCs w:val="32"/>
-        </w:rPr>
-        <w:t>[5, 7, 9]</w:t>
+        <w:t>print(result) # [5, 7, 9]</w:t>
       </w:r>
     </w:p>
     <w:p>
@@ -1605,6 +1699,7 @@
           <w:numId w:val="4"/>
         </w:numPr>
         <w:spacing w:line="240" w:lineRule="auto"/>
+        <w:ind w:left="360"/>
         <w:jc w:val="both"/>
         <w:rPr>
           <w:sz w:val="32"/>
@@ -1652,21 +1747,7 @@
           <w:sz w:val="32"/>
           <w:szCs w:val="32"/>
         </w:rPr>
-        <w:t xml:space="preserve"> when </w:t>
-      </w:r>
-      <w:r>
-        <w:rPr>
-          <w:sz w:val="32"/>
-          <w:szCs w:val="32"/>
-        </w:rPr>
-        <w:t>we</w:t>
-      </w:r>
-      <w:r>
-        <w:rPr>
-          <w:sz w:val="32"/>
-          <w:szCs w:val="32"/>
-        </w:rPr>
-        <w:t>'re applying the same transformation to every element.</w:t>
+        <w:t xml:space="preserve"> when we're applying the same transformation to every element.</w:t>
       </w:r>
     </w:p>
     <w:p>
@@ -1677,6 +1758,7 @@
           <w:numId w:val="4"/>
         </w:numPr>
         <w:spacing w:line="240" w:lineRule="auto"/>
+        <w:ind w:left="360"/>
         <w:jc w:val="both"/>
         <w:rPr>
           <w:sz w:val="32"/>
@@ -1704,14 +1786,7 @@
           <w:sz w:val="32"/>
           <w:szCs w:val="32"/>
         </w:rPr>
-        <w:t xml:space="preserve"> function</w:t>
-      </w:r>
-      <w:r>
-        <w:rPr>
-          <w:sz w:val="32"/>
-          <w:szCs w:val="32"/>
-        </w:rPr>
-        <w:t xml:space="preserve"> for short, simple transformations.</w:t>
+        <w:t xml:space="preserve"> function for short, simple transformations.</w:t>
       </w:r>
     </w:p>
     <w:p>
@@ -1722,6 +1797,7 @@
           <w:numId w:val="4"/>
         </w:numPr>
         <w:spacing w:line="240" w:lineRule="auto"/>
+        <w:ind w:left="360"/>
         <w:jc w:val="both"/>
         <w:rPr>
           <w:sz w:val="32"/>
@@ -1760,6 +1836,7 @@
           <w:numId w:val="4"/>
         </w:numPr>
         <w:spacing w:line="240" w:lineRule="auto"/>
+        <w:ind w:left="360"/>
         <w:jc w:val="both"/>
         <w:rPr>
           <w:sz w:val="32"/>
@@ -1814,47 +1891,1132 @@
           <w:sz w:val="32"/>
           <w:szCs w:val="32"/>
         </w:rPr>
-        <w:t xml:space="preserve">if </w:t>
-      </w:r>
-      <w:r>
-        <w:rPr>
-          <w:sz w:val="32"/>
-          <w:szCs w:val="32"/>
-        </w:rPr>
-        <w:t>we</w:t>
-      </w:r>
-      <w:r>
-        <w:rPr>
-          <w:sz w:val="32"/>
-          <w:szCs w:val="32"/>
-        </w:rPr>
-        <w:t xml:space="preserve"> need a list.</w:t>
-      </w:r>
-    </w:p>
-    <w:p>
-      <w:pPr>
-        <w:spacing w:line="240" w:lineRule="auto"/>
-        <w:jc w:val="both"/>
-        <w:rPr>
-          <w:sz w:val="32"/>
-          <w:szCs w:val="32"/>
-        </w:rPr>
-      </w:pPr>
-    </w:p>
-    <w:p>
-      <w:pPr>
-        <w:spacing w:line="240" w:lineRule="auto"/>
-        <w:jc w:val="both"/>
-        <w:rPr>
-          <w:sz w:val="32"/>
-          <w:szCs w:val="32"/>
-        </w:rPr>
-      </w:pPr>
-    </w:p>
-    <w:p>
-      <w:pPr>
-        <w:spacing w:line="240" w:lineRule="auto"/>
-        <w:jc w:val="both"/>
+        <w:t>if we need a list.</w:t>
+      </w:r>
+    </w:p>
+    <w:p>
+      <w:pPr>
+        <w:spacing w:line="240" w:lineRule="auto"/>
+        <w:jc w:val="both"/>
+        <w:rPr>
+          <w:sz w:val="32"/>
+          <w:szCs w:val="32"/>
+        </w:rPr>
+      </w:pPr>
+    </w:p>
+    <w:p>
+      <w:pPr>
+        <w:spacing w:line="240" w:lineRule="auto"/>
+        <w:jc w:val="center"/>
+        <w:rPr>
+          <w:sz w:val="32"/>
+          <w:szCs w:val="32"/>
+        </w:rPr>
+      </w:pPr>
+      <w:r>
+        <w:rPr>
+          <w:sz w:val="32"/>
+          <w:szCs w:val="32"/>
+        </w:rPr>
+        <w:t>Break</w:t>
+      </w:r>
+    </w:p>
+    <w:p>
+      <w:pPr>
+        <w:spacing w:line="240" w:lineRule="auto"/>
+        <w:jc w:val="both"/>
+        <w:rPr>
+          <w:sz w:val="32"/>
+          <w:szCs w:val="32"/>
+        </w:rPr>
+      </w:pPr>
+    </w:p>
+    <w:p>
+      <w:pPr>
+        <w:spacing w:line="240" w:lineRule="auto"/>
+        <w:jc w:val="both"/>
+        <w:rPr>
+          <w:b/>
+          <w:bCs/>
+          <w:sz w:val="32"/>
+          <w:szCs w:val="32"/>
+        </w:rPr>
+      </w:pPr>
+      <w:proofErr w:type="gramStart"/>
+      <w:r>
+        <w:rPr>
+          <w:b/>
+          <w:bCs/>
+          <w:sz w:val="32"/>
+          <w:szCs w:val="32"/>
+        </w:rPr>
+        <w:t>filter(</w:t>
+      </w:r>
+      <w:proofErr w:type="gramEnd"/>
+      <w:r>
+        <w:rPr>
+          <w:b/>
+          <w:bCs/>
+          <w:sz w:val="32"/>
+          <w:szCs w:val="32"/>
+        </w:rPr>
+        <w:t xml:space="preserve">) </w:t>
+      </w:r>
+      <w:r>
+        <w:rPr>
+          <w:b/>
+          <w:bCs/>
+          <w:sz w:val="32"/>
+          <w:szCs w:val="32"/>
+        </w:rPr>
+        <w:t>Function (Condition Based Selection)</w:t>
+      </w:r>
+      <w:r>
+        <w:rPr>
+          <w:b/>
+          <w:bCs/>
+          <w:sz w:val="32"/>
+          <w:szCs w:val="32"/>
+        </w:rPr>
+        <w:t>:</w:t>
+      </w:r>
+    </w:p>
+    <w:p>
+      <w:pPr>
+        <w:spacing w:line="240" w:lineRule="auto"/>
+        <w:jc w:val="both"/>
+        <w:rPr>
+          <w:sz w:val="32"/>
+          <w:szCs w:val="32"/>
+        </w:rPr>
+      </w:pPr>
+      <w:r>
+        <w:rPr>
+          <w:sz w:val="32"/>
+          <w:szCs w:val="32"/>
+        </w:rPr>
+        <w:t xml:space="preserve"># </w:t>
+      </w:r>
+      <w:r>
+        <w:rPr>
+          <w:sz w:val="32"/>
+          <w:szCs w:val="32"/>
+        </w:rPr>
+        <w:t>The</w:t>
+      </w:r>
+      <w:r>
+        <w:rPr>
+          <w:b/>
+          <w:bCs/>
+          <w:sz w:val="32"/>
+          <w:szCs w:val="32"/>
+        </w:rPr>
+        <w:t xml:space="preserve"> </w:t>
+      </w:r>
+      <w:proofErr w:type="gramStart"/>
+      <w:r>
+        <w:rPr>
+          <w:b/>
+          <w:bCs/>
+          <w:sz w:val="32"/>
+          <w:szCs w:val="32"/>
+        </w:rPr>
+        <w:t>filter(</w:t>
+      </w:r>
+      <w:proofErr w:type="gramEnd"/>
+      <w:r>
+        <w:rPr>
+          <w:b/>
+          <w:bCs/>
+          <w:sz w:val="32"/>
+          <w:szCs w:val="32"/>
+        </w:rPr>
+        <w:t>)</w:t>
+      </w:r>
+      <w:r>
+        <w:rPr>
+          <w:sz w:val="32"/>
+          <w:szCs w:val="32"/>
+        </w:rPr>
+        <w:t xml:space="preserve"> function in Python extracts elements from an </w:t>
+      </w:r>
+      <w:proofErr w:type="spellStart"/>
+      <w:r>
+        <w:rPr>
+          <w:sz w:val="32"/>
+          <w:szCs w:val="32"/>
+        </w:rPr>
+        <w:t>iterable</w:t>
+      </w:r>
+      <w:proofErr w:type="spellEnd"/>
+      <w:r>
+        <w:rPr>
+          <w:sz w:val="32"/>
+          <w:szCs w:val="32"/>
+        </w:rPr>
+        <w:t xml:space="preserve"> (like a list, tuple or set) that satisfy a specific condition.</w:t>
+      </w:r>
+    </w:p>
+    <w:p>
+      <w:pPr>
+        <w:spacing w:line="240" w:lineRule="auto"/>
+        <w:jc w:val="both"/>
+        <w:rPr>
+          <w:sz w:val="32"/>
+          <w:szCs w:val="32"/>
+        </w:rPr>
+      </w:pPr>
+      <w:r>
+        <w:rPr>
+          <w:sz w:val="32"/>
+          <w:szCs w:val="32"/>
+        </w:rPr>
+        <w:t xml:space="preserve"># It iterates through the list automatically from left to right and applies a filtering function to each element and keeping only the ones for which the filter function returns </w:t>
+      </w:r>
+      <w:r>
+        <w:rPr>
+          <w:b/>
+          <w:bCs/>
+          <w:sz w:val="32"/>
+          <w:szCs w:val="32"/>
+        </w:rPr>
+        <w:t>True</w:t>
+      </w:r>
+    </w:p>
+    <w:p>
+      <w:pPr>
+        <w:spacing w:line="240" w:lineRule="auto"/>
+        <w:jc w:val="both"/>
+        <w:rPr>
+          <w:sz w:val="32"/>
+          <w:szCs w:val="32"/>
+        </w:rPr>
+      </w:pPr>
+      <w:r>
+        <w:rPr>
+          <w:sz w:val="32"/>
+          <w:szCs w:val="32"/>
+        </w:rPr>
+        <w:t># Syntax:</w:t>
+      </w:r>
+    </w:p>
+    <w:p>
+      <w:pPr>
+        <w:spacing w:line="240" w:lineRule="auto"/>
+        <w:jc w:val="both"/>
+        <w:rPr>
+          <w:b/>
+          <w:bCs/>
+          <w:color w:val="D86DCB" w:themeColor="accent5" w:themeTint="99"/>
+          <w:sz w:val="32"/>
+          <w:szCs w:val="32"/>
+        </w:rPr>
+      </w:pPr>
+      <w:proofErr w:type="gramStart"/>
+      <w:r>
+        <w:rPr>
+          <w:b/>
+          <w:bCs/>
+          <w:color w:val="D86DCB" w:themeColor="accent5" w:themeTint="99"/>
+          <w:sz w:val="32"/>
+          <w:szCs w:val="32"/>
+        </w:rPr>
+        <w:t>filter(</w:t>
+      </w:r>
+      <w:proofErr w:type="gramEnd"/>
+      <w:r>
+        <w:rPr>
+          <w:b/>
+          <w:bCs/>
+          <w:color w:val="D86DCB" w:themeColor="accent5" w:themeTint="99"/>
+          <w:sz w:val="32"/>
+          <w:szCs w:val="32"/>
+        </w:rPr>
+        <w:t xml:space="preserve">function, </w:t>
+      </w:r>
+      <w:proofErr w:type="spellStart"/>
+      <w:r>
+        <w:rPr>
+          <w:b/>
+          <w:bCs/>
+          <w:color w:val="D86DCB" w:themeColor="accent5" w:themeTint="99"/>
+          <w:sz w:val="32"/>
+          <w:szCs w:val="32"/>
+        </w:rPr>
+        <w:t>iterable</w:t>
+      </w:r>
+      <w:proofErr w:type="spellEnd"/>
+      <w:r>
+        <w:rPr>
+          <w:b/>
+          <w:bCs/>
+          <w:color w:val="D86DCB" w:themeColor="accent5" w:themeTint="99"/>
+          <w:sz w:val="32"/>
+          <w:szCs w:val="32"/>
+        </w:rPr>
+        <w:t>)</w:t>
+      </w:r>
+    </w:p>
+    <w:p>
+      <w:pPr>
+        <w:spacing w:line="240" w:lineRule="auto"/>
+        <w:jc w:val="both"/>
+        <w:rPr>
+          <w:sz w:val="32"/>
+          <w:szCs w:val="32"/>
+        </w:rPr>
+      </w:pPr>
+      <w:r>
+        <w:rPr>
+          <w:sz w:val="32"/>
+          <w:szCs w:val="32"/>
+        </w:rPr>
+        <w:t xml:space="preserve"># But </w:t>
+      </w:r>
+      <w:proofErr w:type="gramStart"/>
+      <w:r>
+        <w:rPr>
+          <w:b/>
+          <w:bCs/>
+          <w:sz w:val="32"/>
+          <w:szCs w:val="32"/>
+        </w:rPr>
+        <w:t>filter(</w:t>
+      </w:r>
+      <w:proofErr w:type="gramEnd"/>
+      <w:r>
+        <w:rPr>
+          <w:b/>
+          <w:bCs/>
+          <w:sz w:val="32"/>
+          <w:szCs w:val="32"/>
+        </w:rPr>
+        <w:t>)</w:t>
+      </w:r>
+      <w:r>
+        <w:rPr>
+          <w:sz w:val="32"/>
+          <w:szCs w:val="32"/>
+        </w:rPr>
+        <w:t xml:space="preserve"> function gives us a </w:t>
+      </w:r>
+      <w:r>
+        <w:rPr>
+          <w:b/>
+          <w:bCs/>
+          <w:sz w:val="32"/>
+          <w:szCs w:val="32"/>
+        </w:rPr>
+        <w:t>&lt;filter object at 0x000001DE9E2D14E0&gt;</w:t>
+      </w:r>
+      <w:r>
+        <w:rPr>
+          <w:sz w:val="32"/>
+          <w:szCs w:val="32"/>
+        </w:rPr>
+        <w:t xml:space="preserve"> which we need to convert to a list using </w:t>
+      </w:r>
+      <w:r>
+        <w:rPr>
+          <w:b/>
+          <w:bCs/>
+          <w:sz w:val="32"/>
+          <w:szCs w:val="32"/>
+        </w:rPr>
+        <w:t>list()</w:t>
+      </w:r>
+      <w:r>
+        <w:rPr>
+          <w:sz w:val="32"/>
+          <w:szCs w:val="32"/>
+        </w:rPr>
+        <w:t xml:space="preserve"> function (cast)</w:t>
+      </w:r>
+    </w:p>
+    <w:p>
+      <w:pPr>
+        <w:spacing w:line="240" w:lineRule="auto"/>
+        <w:jc w:val="both"/>
+        <w:rPr>
+          <w:sz w:val="32"/>
+          <w:szCs w:val="32"/>
+        </w:rPr>
+      </w:pPr>
+      <w:r>
+        <w:rPr>
+          <w:sz w:val="32"/>
+          <w:szCs w:val="32"/>
+        </w:rPr>
+        <w:t xml:space="preserve"># </w:t>
+      </w:r>
+      <w:r>
+        <w:rPr>
+          <w:b/>
+          <w:bCs/>
+          <w:sz w:val="32"/>
+          <w:szCs w:val="32"/>
+        </w:rPr>
+        <w:t>lambda</w:t>
+      </w:r>
+      <w:r>
+        <w:rPr>
+          <w:sz w:val="32"/>
+          <w:szCs w:val="32"/>
+        </w:rPr>
+        <w:t xml:space="preserve"> function can be used here if we want one simple expression and it returns a bool</w:t>
+      </w:r>
+    </w:p>
+    <w:p>
+      <w:pPr>
+        <w:spacing w:line="240" w:lineRule="auto"/>
+        <w:jc w:val="both"/>
+        <w:rPr>
+          <w:b/>
+          <w:bCs/>
+          <w:color w:val="D86DCB" w:themeColor="accent5" w:themeTint="99"/>
+          <w:sz w:val="32"/>
+          <w:szCs w:val="32"/>
+        </w:rPr>
+      </w:pPr>
+      <w:r>
+        <w:rPr>
+          <w:b/>
+          <w:bCs/>
+          <w:color w:val="D86DCB" w:themeColor="accent5" w:themeTint="99"/>
+          <w:sz w:val="32"/>
+          <w:szCs w:val="32"/>
+        </w:rPr>
+        <w:t>numbers = [1, 2, 3, 4, 5, 6,]</w:t>
+      </w:r>
+    </w:p>
+    <w:p>
+      <w:pPr>
+        <w:spacing w:line="240" w:lineRule="auto"/>
+        <w:jc w:val="both"/>
+        <w:rPr>
+          <w:b/>
+          <w:bCs/>
+          <w:color w:val="D86DCB" w:themeColor="accent5" w:themeTint="99"/>
+          <w:sz w:val="32"/>
+          <w:szCs w:val="32"/>
+        </w:rPr>
+      </w:pPr>
+      <w:r>
+        <w:rPr>
+          <w:b/>
+          <w:bCs/>
+          <w:color w:val="D86DCB" w:themeColor="accent5" w:themeTint="99"/>
+          <w:sz w:val="32"/>
+          <w:szCs w:val="32"/>
+        </w:rPr>
+        <w:t># keeping only even numbers</w:t>
+      </w:r>
+    </w:p>
+    <w:p>
+      <w:pPr>
+        <w:spacing w:line="240" w:lineRule="auto"/>
+        <w:jc w:val="both"/>
+        <w:rPr>
+          <w:b/>
+          <w:bCs/>
+          <w:color w:val="D86DCB" w:themeColor="accent5" w:themeTint="99"/>
+          <w:sz w:val="32"/>
+          <w:szCs w:val="32"/>
+        </w:rPr>
+      </w:pPr>
+      <w:proofErr w:type="spellStart"/>
+      <w:r>
+        <w:rPr>
+          <w:b/>
+          <w:bCs/>
+          <w:color w:val="D86DCB" w:themeColor="accent5" w:themeTint="99"/>
+          <w:sz w:val="32"/>
+          <w:szCs w:val="32"/>
+        </w:rPr>
+        <w:t>even_numbers</w:t>
+      </w:r>
+      <w:proofErr w:type="spellEnd"/>
+      <w:r>
+        <w:rPr>
+          <w:b/>
+          <w:bCs/>
+          <w:color w:val="D86DCB" w:themeColor="accent5" w:themeTint="99"/>
+          <w:sz w:val="32"/>
+          <w:szCs w:val="32"/>
+        </w:rPr>
+        <w:t xml:space="preserve"> = </w:t>
+      </w:r>
+      <w:proofErr w:type="gramStart"/>
+      <w:r>
+        <w:rPr>
+          <w:b/>
+          <w:bCs/>
+          <w:color w:val="D86DCB" w:themeColor="accent5" w:themeTint="99"/>
+          <w:sz w:val="32"/>
+          <w:szCs w:val="32"/>
+        </w:rPr>
+        <w:t>list(</w:t>
+      </w:r>
+      <w:proofErr w:type="gramEnd"/>
+      <w:r>
+        <w:rPr>
+          <w:b/>
+          <w:bCs/>
+          <w:color w:val="D86DCB" w:themeColor="accent5" w:themeTint="99"/>
+          <w:sz w:val="32"/>
+          <w:szCs w:val="32"/>
+        </w:rPr>
+        <w:t>filter(lambda x: x % 2 == 0, numbers))</w:t>
+      </w:r>
+    </w:p>
+    <w:p>
+      <w:pPr>
+        <w:spacing w:line="240" w:lineRule="auto"/>
+        <w:jc w:val="both"/>
+        <w:rPr>
+          <w:b/>
+          <w:bCs/>
+          <w:color w:val="D86DCB" w:themeColor="accent5" w:themeTint="99"/>
+          <w:sz w:val="32"/>
+          <w:szCs w:val="32"/>
+        </w:rPr>
+      </w:pPr>
+      <w:r>
+        <w:rPr>
+          <w:b/>
+          <w:bCs/>
+          <w:color w:val="D86DCB" w:themeColor="accent5" w:themeTint="99"/>
+          <w:sz w:val="32"/>
+          <w:szCs w:val="32"/>
+        </w:rPr>
+        <w:t>print(</w:t>
+      </w:r>
+      <w:proofErr w:type="spellStart"/>
+      <w:r>
+        <w:rPr>
+          <w:b/>
+          <w:bCs/>
+          <w:color w:val="D86DCB" w:themeColor="accent5" w:themeTint="99"/>
+          <w:sz w:val="32"/>
+          <w:szCs w:val="32"/>
+        </w:rPr>
+        <w:t>even_numbers</w:t>
+      </w:r>
+      <w:proofErr w:type="spellEnd"/>
+      <w:r>
+        <w:rPr>
+          <w:b/>
+          <w:bCs/>
+          <w:color w:val="D86DCB" w:themeColor="accent5" w:themeTint="99"/>
+          <w:sz w:val="32"/>
+          <w:szCs w:val="32"/>
+        </w:rPr>
+        <w:t>) # [2, 4, 6]</w:t>
+      </w:r>
+    </w:p>
+    <w:p>
+      <w:pPr>
+        <w:spacing w:line="240" w:lineRule="auto"/>
+        <w:jc w:val="both"/>
+        <w:rPr>
+          <w:sz w:val="32"/>
+          <w:szCs w:val="32"/>
+        </w:rPr>
+      </w:pPr>
+    </w:p>
+    <w:p>
+      <w:pPr>
+        <w:spacing w:line="240" w:lineRule="auto"/>
+        <w:jc w:val="both"/>
+        <w:rPr>
+          <w:sz w:val="32"/>
+          <w:szCs w:val="32"/>
+        </w:rPr>
+      </w:pPr>
+    </w:p>
+    <w:p>
+      <w:pPr>
+        <w:spacing w:line="240" w:lineRule="auto"/>
+        <w:jc w:val="center"/>
+        <w:rPr>
+          <w:sz w:val="32"/>
+          <w:szCs w:val="32"/>
+        </w:rPr>
+      </w:pPr>
+      <w:r>
+        <w:rPr>
+          <w:sz w:val="32"/>
+          <w:szCs w:val="32"/>
+        </w:rPr>
+        <w:t>Break</w:t>
+      </w:r>
+    </w:p>
+    <w:p>
+      <w:pPr>
+        <w:spacing w:line="240" w:lineRule="auto"/>
+        <w:jc w:val="both"/>
+        <w:rPr>
+          <w:sz w:val="32"/>
+          <w:szCs w:val="32"/>
+        </w:rPr>
+      </w:pPr>
+    </w:p>
+    <w:p>
+      <w:pPr>
+        <w:spacing w:line="240" w:lineRule="auto"/>
+        <w:jc w:val="both"/>
+        <w:rPr>
+          <w:b/>
+          <w:bCs/>
+          <w:sz w:val="32"/>
+          <w:szCs w:val="32"/>
+        </w:rPr>
+      </w:pPr>
+      <w:proofErr w:type="gramStart"/>
+      <w:r>
+        <w:rPr>
+          <w:b/>
+          <w:bCs/>
+          <w:sz w:val="32"/>
+          <w:szCs w:val="32"/>
+        </w:rPr>
+        <w:t>reduce</w:t>
+      </w:r>
+      <w:r>
+        <w:rPr>
+          <w:b/>
+          <w:bCs/>
+          <w:sz w:val="32"/>
+          <w:szCs w:val="32"/>
+        </w:rPr>
+        <w:t>(</w:t>
+      </w:r>
+      <w:proofErr w:type="gramEnd"/>
+      <w:r>
+        <w:rPr>
+          <w:b/>
+          <w:bCs/>
+          <w:sz w:val="32"/>
+          <w:szCs w:val="32"/>
+        </w:rPr>
+        <w:t>) Function</w:t>
+      </w:r>
+      <w:r>
+        <w:rPr>
+          <w:b/>
+          <w:bCs/>
+          <w:sz w:val="32"/>
+          <w:szCs w:val="32"/>
+        </w:rPr>
+        <w:t>:</w:t>
+      </w:r>
+    </w:p>
+    <w:p>
+      <w:pPr>
+        <w:spacing w:line="240" w:lineRule="auto"/>
+        <w:jc w:val="both"/>
+        <w:rPr>
+          <w:sz w:val="32"/>
+          <w:szCs w:val="32"/>
+        </w:rPr>
+      </w:pPr>
+      <w:r>
+        <w:rPr>
+          <w:sz w:val="32"/>
+          <w:szCs w:val="32"/>
+        </w:rPr>
+        <w:t xml:space="preserve"># </w:t>
+      </w:r>
+      <w:r>
+        <w:rPr>
+          <w:sz w:val="32"/>
+          <w:szCs w:val="32"/>
+        </w:rPr>
+        <w:t xml:space="preserve">The </w:t>
+      </w:r>
+      <w:proofErr w:type="gramStart"/>
+      <w:r>
+        <w:rPr>
+          <w:b/>
+          <w:bCs/>
+          <w:sz w:val="32"/>
+          <w:szCs w:val="32"/>
+        </w:rPr>
+        <w:t>reduce(</w:t>
+      </w:r>
+      <w:proofErr w:type="gramEnd"/>
+      <w:r>
+        <w:rPr>
+          <w:b/>
+          <w:bCs/>
+          <w:sz w:val="32"/>
+          <w:szCs w:val="32"/>
+        </w:rPr>
+        <w:t>)</w:t>
+      </w:r>
+      <w:r>
+        <w:rPr>
+          <w:sz w:val="32"/>
+          <w:szCs w:val="32"/>
+        </w:rPr>
+        <w:t xml:space="preserve"> function in Python applies a specified function to the elements of an </w:t>
+      </w:r>
+      <w:proofErr w:type="spellStart"/>
+      <w:r>
+        <w:rPr>
+          <w:sz w:val="32"/>
+          <w:szCs w:val="32"/>
+        </w:rPr>
+        <w:t>iterable</w:t>
+      </w:r>
+      <w:proofErr w:type="spellEnd"/>
+      <w:r>
+        <w:rPr>
+          <w:sz w:val="32"/>
+          <w:szCs w:val="32"/>
+        </w:rPr>
+        <w:t xml:space="preserve"> (like a list, tuple or set) iteratively from </w:t>
+      </w:r>
+      <w:r>
+        <w:rPr>
+          <w:sz w:val="32"/>
+          <w:szCs w:val="32"/>
+        </w:rPr>
+        <w:lastRenderedPageBreak/>
+        <w:t>left to right to compress the entire elements of the list down to a single value</w:t>
+      </w:r>
+    </w:p>
+    <w:p>
+      <w:pPr>
+        <w:spacing w:line="240" w:lineRule="auto"/>
+        <w:jc w:val="both"/>
+        <w:rPr>
+          <w:sz w:val="32"/>
+          <w:szCs w:val="32"/>
+        </w:rPr>
+      </w:pPr>
+      <w:r>
+        <w:rPr>
+          <w:sz w:val="32"/>
+          <w:szCs w:val="32"/>
+        </w:rPr>
+        <w:t xml:space="preserve"># It’s from </w:t>
+      </w:r>
+      <w:proofErr w:type="spellStart"/>
+      <w:r>
+        <w:rPr>
+          <w:b/>
+          <w:bCs/>
+          <w:sz w:val="32"/>
+          <w:szCs w:val="32"/>
+        </w:rPr>
+        <w:t>functools</w:t>
+      </w:r>
+      <w:proofErr w:type="spellEnd"/>
+      <w:r>
+        <w:rPr>
+          <w:sz w:val="32"/>
+          <w:szCs w:val="32"/>
+        </w:rPr>
+        <w:t xml:space="preserve"> module and we need to import it from there.</w:t>
+      </w:r>
+    </w:p>
+    <w:p>
+      <w:pPr>
+        <w:spacing w:line="240" w:lineRule="auto"/>
+        <w:jc w:val="both"/>
+        <w:rPr>
+          <w:sz w:val="32"/>
+          <w:szCs w:val="32"/>
+        </w:rPr>
+      </w:pPr>
+      <w:r>
+        <w:rPr>
+          <w:sz w:val="32"/>
+          <w:szCs w:val="32"/>
+        </w:rPr>
+        <w:t># Arguments or parameters:</w:t>
+      </w:r>
+    </w:p>
+    <w:p>
+      <w:pPr>
+        <w:pStyle w:val="ListParagraph"/>
+        <w:numPr>
+          <w:ilvl w:val="0"/>
+          <w:numId w:val="10"/>
+        </w:numPr>
+        <w:spacing w:line="240" w:lineRule="auto"/>
+        <w:jc w:val="both"/>
+        <w:rPr>
+          <w:sz w:val="32"/>
+          <w:szCs w:val="32"/>
+        </w:rPr>
+      </w:pPr>
+      <w:r>
+        <w:rPr>
+          <w:b/>
+          <w:bCs/>
+          <w:sz w:val="32"/>
+          <w:szCs w:val="32"/>
+        </w:rPr>
+        <w:t>function:</w:t>
+      </w:r>
+      <w:r>
+        <w:rPr>
+          <w:sz w:val="32"/>
+          <w:szCs w:val="32"/>
+        </w:rPr>
+        <w:t xml:space="preserve"> A function that accepts exactly two arguments</w:t>
+      </w:r>
+    </w:p>
+    <w:p>
+      <w:pPr>
+        <w:pStyle w:val="ListParagraph"/>
+        <w:numPr>
+          <w:ilvl w:val="0"/>
+          <w:numId w:val="10"/>
+        </w:numPr>
+        <w:spacing w:line="240" w:lineRule="auto"/>
+        <w:jc w:val="both"/>
+        <w:rPr>
+          <w:sz w:val="32"/>
+          <w:szCs w:val="32"/>
+        </w:rPr>
+      </w:pPr>
+      <w:proofErr w:type="spellStart"/>
+      <w:r>
+        <w:rPr>
+          <w:b/>
+          <w:bCs/>
+          <w:sz w:val="32"/>
+          <w:szCs w:val="32"/>
+        </w:rPr>
+        <w:t>iterable</w:t>
+      </w:r>
+      <w:proofErr w:type="spellEnd"/>
+      <w:r>
+        <w:rPr>
+          <w:b/>
+          <w:bCs/>
+          <w:sz w:val="32"/>
+          <w:szCs w:val="32"/>
+        </w:rPr>
+        <w:t>:</w:t>
+      </w:r>
+      <w:r>
+        <w:rPr>
+          <w:sz w:val="32"/>
+          <w:szCs w:val="32"/>
+        </w:rPr>
+        <w:t xml:space="preserve"> The collection of items to processed (list)</w:t>
+      </w:r>
+    </w:p>
+    <w:p>
+      <w:pPr>
+        <w:pStyle w:val="ListParagraph"/>
+        <w:numPr>
+          <w:ilvl w:val="0"/>
+          <w:numId w:val="10"/>
+        </w:numPr>
+        <w:spacing w:line="240" w:lineRule="auto"/>
+        <w:jc w:val="both"/>
+        <w:rPr>
+          <w:sz w:val="32"/>
+          <w:szCs w:val="32"/>
+        </w:rPr>
+      </w:pPr>
+      <w:r>
+        <w:rPr>
+          <w:b/>
+          <w:bCs/>
+          <w:sz w:val="32"/>
+          <w:szCs w:val="32"/>
+        </w:rPr>
+        <w:t xml:space="preserve">initializer: </w:t>
+      </w:r>
+      <w:r>
+        <w:rPr>
+          <w:sz w:val="32"/>
+          <w:szCs w:val="32"/>
+        </w:rPr>
+        <w:t>(Optional) A starting value placed before the items in the sequence</w:t>
+      </w:r>
+    </w:p>
+    <w:p>
+      <w:pPr>
+        <w:spacing w:line="240" w:lineRule="auto"/>
+        <w:jc w:val="both"/>
+        <w:rPr>
+          <w:b/>
+          <w:bCs/>
+          <w:sz w:val="32"/>
+          <w:szCs w:val="32"/>
+        </w:rPr>
+      </w:pPr>
+      <w:proofErr w:type="gramStart"/>
+      <w:r>
+        <w:rPr>
+          <w:b/>
+          <w:bCs/>
+          <w:sz w:val="32"/>
+          <w:szCs w:val="32"/>
+        </w:rPr>
+        <w:t>reduce(</w:t>
+      </w:r>
+      <w:proofErr w:type="gramEnd"/>
+      <w:r>
+        <w:rPr>
+          <w:b/>
+          <w:bCs/>
+          <w:sz w:val="32"/>
+          <w:szCs w:val="32"/>
+        </w:rPr>
+        <w:t xml:space="preserve">function, </w:t>
+      </w:r>
+      <w:proofErr w:type="spellStart"/>
+      <w:r>
+        <w:rPr>
+          <w:b/>
+          <w:bCs/>
+          <w:sz w:val="32"/>
+          <w:szCs w:val="32"/>
+        </w:rPr>
+        <w:t>iterable</w:t>
+      </w:r>
+      <w:proofErr w:type="spellEnd"/>
+      <w:r>
+        <w:rPr>
+          <w:b/>
+          <w:bCs/>
+          <w:sz w:val="32"/>
+          <w:szCs w:val="32"/>
+        </w:rPr>
+        <w:t>, initializer= None)</w:t>
+      </w:r>
+    </w:p>
+    <w:p>
+      <w:pPr>
+        <w:spacing w:line="240" w:lineRule="auto"/>
+        <w:jc w:val="both"/>
+        <w:rPr>
+          <w:sz w:val="32"/>
+          <w:szCs w:val="32"/>
+        </w:rPr>
+      </w:pPr>
+      <w:r>
+        <w:rPr>
+          <w:sz w:val="32"/>
+          <w:szCs w:val="32"/>
+        </w:rPr>
+        <w:t xml:space="preserve"># </w:t>
+      </w:r>
+      <w:r>
+        <w:rPr>
+          <w:b/>
+          <w:bCs/>
+          <w:sz w:val="32"/>
+          <w:szCs w:val="32"/>
+        </w:rPr>
+        <w:t>lambda</w:t>
+      </w:r>
+      <w:r>
+        <w:rPr>
+          <w:sz w:val="32"/>
+          <w:szCs w:val="32"/>
+        </w:rPr>
+        <w:t xml:space="preserve"> function can be used for simple single expression and it will return a single value</w:t>
+      </w:r>
+    </w:p>
+    <w:p>
+      <w:pPr>
+        <w:spacing w:line="240" w:lineRule="auto"/>
+        <w:jc w:val="both"/>
+        <w:rPr>
+          <w:sz w:val="32"/>
+          <w:szCs w:val="32"/>
+        </w:rPr>
+      </w:pPr>
+      <w:r>
+        <w:rPr>
+          <w:sz w:val="32"/>
+          <w:szCs w:val="32"/>
+        </w:rPr>
+        <w:t xml:space="preserve"># </w:t>
+      </w:r>
+      <w:r>
+        <w:rPr>
+          <w:sz w:val="32"/>
+          <w:szCs w:val="32"/>
+        </w:rPr>
+        <w:t>K</w:t>
+      </w:r>
+      <w:r>
+        <w:rPr>
+          <w:sz w:val="32"/>
+          <w:szCs w:val="32"/>
+        </w:rPr>
+        <w:t>eeps the larger value at each comparison step using ternary operator</w:t>
+      </w:r>
+      <w:r>
+        <w:rPr>
+          <w:b/>
+          <w:bCs/>
+          <w:sz w:val="32"/>
+          <w:szCs w:val="32"/>
+        </w:rPr>
+        <w:t xml:space="preserve"> … if condition else …</w:t>
+      </w:r>
+    </w:p>
+    <w:p>
+      <w:pPr>
+        <w:spacing w:line="240" w:lineRule="auto"/>
+        <w:jc w:val="both"/>
+        <w:rPr>
+          <w:b/>
+          <w:bCs/>
+          <w:color w:val="D86DCB" w:themeColor="accent5" w:themeTint="99"/>
+          <w:sz w:val="32"/>
+          <w:szCs w:val="32"/>
+        </w:rPr>
+      </w:pPr>
+      <w:r>
+        <w:rPr>
+          <w:b/>
+          <w:bCs/>
+          <w:color w:val="D86DCB" w:themeColor="accent5" w:themeTint="99"/>
+          <w:sz w:val="32"/>
+          <w:szCs w:val="32"/>
+        </w:rPr>
+        <w:t xml:space="preserve">from </w:t>
+      </w:r>
+      <w:proofErr w:type="spellStart"/>
+      <w:r>
+        <w:rPr>
+          <w:b/>
+          <w:bCs/>
+          <w:color w:val="D86DCB" w:themeColor="accent5" w:themeTint="99"/>
+          <w:sz w:val="32"/>
+          <w:szCs w:val="32"/>
+        </w:rPr>
+        <w:t>functools</w:t>
+      </w:r>
+      <w:proofErr w:type="spellEnd"/>
+      <w:r>
+        <w:rPr>
+          <w:b/>
+          <w:bCs/>
+          <w:color w:val="D86DCB" w:themeColor="accent5" w:themeTint="99"/>
+          <w:sz w:val="32"/>
+          <w:szCs w:val="32"/>
+        </w:rPr>
+        <w:t xml:space="preserve"> import reduce</w:t>
+      </w:r>
+    </w:p>
+    <w:p>
+      <w:pPr>
+        <w:spacing w:line="240" w:lineRule="auto"/>
+        <w:jc w:val="both"/>
+        <w:rPr>
+          <w:b/>
+          <w:bCs/>
+          <w:color w:val="D86DCB" w:themeColor="accent5" w:themeTint="99"/>
+          <w:sz w:val="32"/>
+          <w:szCs w:val="32"/>
+        </w:rPr>
+      </w:pPr>
+      <w:r>
+        <w:rPr>
+          <w:b/>
+          <w:bCs/>
+          <w:color w:val="D86DCB" w:themeColor="accent5" w:themeTint="99"/>
+          <w:sz w:val="32"/>
+          <w:szCs w:val="32"/>
+        </w:rPr>
+        <w:t>numbers = [15, 42, 12, 90, 8]</w:t>
+      </w:r>
+    </w:p>
+    <w:p>
+      <w:pPr>
+        <w:spacing w:line="240" w:lineRule="auto"/>
+        <w:jc w:val="both"/>
+        <w:rPr>
+          <w:b/>
+          <w:bCs/>
+          <w:color w:val="D86DCB" w:themeColor="accent5" w:themeTint="99"/>
+          <w:sz w:val="32"/>
+          <w:szCs w:val="32"/>
+        </w:rPr>
+      </w:pPr>
+      <w:r>
+        <w:rPr>
+          <w:b/>
+          <w:bCs/>
+          <w:color w:val="D86DCB" w:themeColor="accent5" w:themeTint="99"/>
+          <w:sz w:val="32"/>
+          <w:szCs w:val="32"/>
+        </w:rPr>
+        <w:t xml:space="preserve">largest = </w:t>
+      </w:r>
+      <w:proofErr w:type="gramStart"/>
+      <w:r>
+        <w:rPr>
+          <w:b/>
+          <w:bCs/>
+          <w:color w:val="D86DCB" w:themeColor="accent5" w:themeTint="99"/>
+          <w:sz w:val="32"/>
+          <w:szCs w:val="32"/>
+        </w:rPr>
+        <w:t>reduce(</w:t>
+      </w:r>
+      <w:proofErr w:type="gramEnd"/>
+      <w:r>
+        <w:rPr>
+          <w:b/>
+          <w:bCs/>
+          <w:color w:val="D86DCB" w:themeColor="accent5" w:themeTint="99"/>
+          <w:sz w:val="32"/>
+          <w:szCs w:val="32"/>
+        </w:rPr>
+        <w:t>lambda x, y: x if x &gt; y else y, numbers)</w:t>
+      </w:r>
+    </w:p>
+    <w:p>
+      <w:pPr>
+        <w:spacing w:line="240" w:lineRule="auto"/>
+        <w:jc w:val="both"/>
+        <w:rPr>
+          <w:b/>
+          <w:bCs/>
+          <w:color w:val="D86DCB" w:themeColor="accent5" w:themeTint="99"/>
+          <w:sz w:val="32"/>
+          <w:szCs w:val="32"/>
+        </w:rPr>
+      </w:pPr>
+      <w:r>
+        <w:rPr>
+          <w:b/>
+          <w:bCs/>
+          <w:color w:val="D86DCB" w:themeColor="accent5" w:themeTint="99"/>
+          <w:sz w:val="32"/>
+          <w:szCs w:val="32"/>
+        </w:rPr>
+        <w:t>print(largest) # 90</w:t>
+      </w:r>
+    </w:p>
+    <w:p>
+      <w:pPr>
+        <w:spacing w:line="240" w:lineRule="auto"/>
+        <w:jc w:val="both"/>
+        <w:rPr>
+          <w:sz w:val="32"/>
+          <w:szCs w:val="32"/>
+        </w:rPr>
+      </w:pPr>
+    </w:p>
+    <w:p>
+      <w:pPr>
+        <w:spacing w:line="240" w:lineRule="auto"/>
+        <w:jc w:val="center"/>
         <w:rPr>
           <w:sz w:val="32"/>
           <w:szCs w:val="32"/>
@@ -1918,7 +3080,34 @@
           <w:sz w:val="32"/>
           <w:szCs w:val="32"/>
         </w:rPr>
-        <w:t>):</w:t>
+        <w:t>)</w:t>
+      </w:r>
+      <w:r>
+        <w:rPr>
+          <w:b/>
+          <w:bCs/>
+          <w:sz w:val="32"/>
+          <w:szCs w:val="32"/>
+        </w:rPr>
+        <w:t xml:space="preserve"> </w:t>
+      </w:r>
+      <w:r>
+        <w:rPr>
+          <w:b/>
+          <w:bCs/>
+          <w:sz w:val="32"/>
+          <w:szCs w:val="32"/>
+        </w:rPr>
+        <w:t>Function</w:t>
+      </w:r>
+      <w:r>
+        <w:rPr>
+          <w:b/>
+          <w:bCs/>
+          <w:sz w:val="32"/>
+          <w:szCs w:val="32"/>
+        </w:rPr>
+        <w:t>:</w:t>
       </w:r>
     </w:p>
     <w:p>
@@ -2065,6 +3254,7 @@
           <w:sz w:val="32"/>
           <w:szCs w:val="32"/>
         </w:rPr>
+        <w:lastRenderedPageBreak/>
         <w:t># We get both in one go. Quick intuition, think: “Split this number into how many full parts + what’s left over”</w:t>
       </w:r>
     </w:p>
@@ -2718,7 +3908,6 @@
           <w:sz w:val="32"/>
           <w:szCs w:val="32"/>
         </w:rPr>
-        <w:lastRenderedPageBreak/>
         <w:t>print(</w:t>
       </w:r>
       <w:proofErr w:type="spellStart"/>
@@ -3025,7 +4214,7 @@
       <w:lvlText w:val=""/>
       <w:lvlJc w:val="left"/>
       <w:pPr>
-        <w:ind w:left="360" w:hanging="360"/>
+        <w:ind w:left="0" w:hanging="360"/>
       </w:pPr>
       <w:rPr>
         <w:rFonts w:ascii="Symbol" w:hAnsi="Symbol" w:hint="default"/>
@@ -3037,7 +4226,7 @@
       <w:lvlText w:val="o"/>
       <w:lvlJc w:val="left"/>
       <w:pPr>
-        <w:ind w:left="1080" w:hanging="360"/>
+        <w:ind w:left="720" w:hanging="360"/>
       </w:pPr>
       <w:rPr>
         <w:rFonts w:ascii="Courier New" w:hAnsi="Courier New" w:cs="Courier New" w:hint="default"/>
@@ -3049,7 +4238,7 @@
       <w:lvlText w:val=""/>
       <w:lvlJc w:val="left"/>
       <w:pPr>
-        <w:ind w:left="1800" w:hanging="360"/>
+        <w:ind w:left="1440" w:hanging="360"/>
       </w:pPr>
       <w:rPr>
         <w:rFonts w:ascii="Wingdings" w:hAnsi="Wingdings" w:hint="default"/>
@@ -3061,7 +4250,7 @@
       <w:lvlText w:val=""/>
       <w:lvlJc w:val="left"/>
       <w:pPr>
-        <w:ind w:left="2520" w:hanging="360"/>
+        <w:ind w:left="2160" w:hanging="360"/>
       </w:pPr>
       <w:rPr>
         <w:rFonts w:ascii="Symbol" w:hAnsi="Symbol" w:hint="default"/>
@@ -3073,7 +4262,7 @@
       <w:lvlText w:val="o"/>
       <w:lvlJc w:val="left"/>
       <w:pPr>
-        <w:ind w:left="3240" w:hanging="360"/>
+        <w:ind w:left="2880" w:hanging="360"/>
       </w:pPr>
       <w:rPr>
         <w:rFonts w:ascii="Courier New" w:hAnsi="Courier New" w:cs="Courier New" w:hint="default"/>
@@ -3085,7 +4274,7 @@
       <w:lvlText w:val=""/>
       <w:lvlJc w:val="left"/>
       <w:pPr>
-        <w:ind w:left="3960" w:hanging="360"/>
+        <w:ind w:left="3600" w:hanging="360"/>
       </w:pPr>
       <w:rPr>
         <w:rFonts w:ascii="Wingdings" w:hAnsi="Wingdings" w:hint="default"/>
@@ -3097,7 +4286,7 @@
       <w:lvlText w:val=""/>
       <w:lvlJc w:val="left"/>
       <w:pPr>
-        <w:ind w:left="4680" w:hanging="360"/>
+        <w:ind w:left="4320" w:hanging="360"/>
       </w:pPr>
       <w:rPr>
         <w:rFonts w:ascii="Symbol" w:hAnsi="Symbol" w:hint="default"/>
@@ -3109,7 +4298,7 @@
       <w:lvlText w:val="o"/>
       <w:lvlJc w:val="left"/>
       <w:pPr>
-        <w:ind w:left="5400" w:hanging="360"/>
+        <w:ind w:left="5040" w:hanging="360"/>
       </w:pPr>
       <w:rPr>
         <w:rFonts w:ascii="Courier New" w:hAnsi="Courier New" w:cs="Courier New" w:hint="default"/>
@@ -3121,7 +4310,7 @@
       <w:lvlText w:val=""/>
       <w:lvlJc w:val="left"/>
       <w:pPr>
-        <w:ind w:left="6120" w:hanging="360"/>
+        <w:ind w:left="5760" w:hanging="360"/>
       </w:pPr>
       <w:rPr>
         <w:rFonts w:ascii="Wingdings" w:hAnsi="Wingdings" w:hint="default"/>
@@ -3129,6 +4318,301 @@
     </w:lvl>
   </w:abstractNum>
   <w:abstractNum w:abstractNumId="1" w15:restartNumberingAfterBreak="0">
+    <w:nsid w:val="11495BB1"/>
+    <w:multiLevelType w:val="hybridMultilevel"/>
+    <w:tmpl w:val="98186254"/>
+    <w:lvl w:ilvl="0" w:tplc="DFC8A664">
+      <w:start w:val="1"/>
+      <w:numFmt w:val="decimal"/>
+      <w:lvlText w:val="%1."/>
+      <w:lvlJc w:val="left"/>
+      <w:pPr>
+        <w:ind w:left="360" w:hanging="360"/>
+      </w:pPr>
+      <w:rPr>
+        <w:rFonts w:hint="default"/>
+        <w:b/>
+        <w:bCs/>
+      </w:rPr>
+    </w:lvl>
+    <w:lvl w:ilvl="1" w:tplc="04090019" w:tentative="1">
+      <w:start w:val="1"/>
+      <w:numFmt w:val="lowerLetter"/>
+      <w:lvlText w:val="%2."/>
+      <w:lvlJc w:val="left"/>
+      <w:pPr>
+        <w:ind w:left="1440" w:hanging="360"/>
+      </w:pPr>
+    </w:lvl>
+    <w:lvl w:ilvl="2" w:tplc="0409001B" w:tentative="1">
+      <w:start w:val="1"/>
+      <w:numFmt w:val="lowerRoman"/>
+      <w:lvlText w:val="%3."/>
+      <w:lvlJc w:val="right"/>
+      <w:pPr>
+        <w:ind w:left="2160" w:hanging="180"/>
+      </w:pPr>
+    </w:lvl>
+    <w:lvl w:ilvl="3" w:tplc="0409000F" w:tentative="1">
+      <w:start w:val="1"/>
+      <w:numFmt w:val="decimal"/>
+      <w:lvlText w:val="%4."/>
+      <w:lvlJc w:val="left"/>
+      <w:pPr>
+        <w:ind w:left="2880" w:hanging="360"/>
+      </w:pPr>
+    </w:lvl>
+    <w:lvl w:ilvl="4" w:tplc="04090019" w:tentative="1">
+      <w:start w:val="1"/>
+      <w:numFmt w:val="lowerLetter"/>
+      <w:lvlText w:val="%5."/>
+      <w:lvlJc w:val="left"/>
+      <w:pPr>
+        <w:ind w:left="3600" w:hanging="360"/>
+      </w:pPr>
+    </w:lvl>
+    <w:lvl w:ilvl="5" w:tplc="0409001B" w:tentative="1">
+      <w:start w:val="1"/>
+      <w:numFmt w:val="lowerRoman"/>
+      <w:lvlText w:val="%6."/>
+      <w:lvlJc w:val="right"/>
+      <w:pPr>
+        <w:ind w:left="4320" w:hanging="180"/>
+      </w:pPr>
+    </w:lvl>
+    <w:lvl w:ilvl="6" w:tplc="0409000F" w:tentative="1">
+      <w:start w:val="1"/>
+      <w:numFmt w:val="decimal"/>
+      <w:lvlText w:val="%7."/>
+      <w:lvlJc w:val="left"/>
+      <w:pPr>
+        <w:ind w:left="5040" w:hanging="360"/>
+      </w:pPr>
+    </w:lvl>
+    <w:lvl w:ilvl="7" w:tplc="04090019" w:tentative="1">
+      <w:start w:val="1"/>
+      <w:numFmt w:val="lowerLetter"/>
+      <w:lvlText w:val="%8."/>
+      <w:lvlJc w:val="left"/>
+      <w:pPr>
+        <w:ind w:left="5760" w:hanging="360"/>
+      </w:pPr>
+    </w:lvl>
+    <w:lvl w:ilvl="8" w:tplc="0409001B" w:tentative="1">
+      <w:start w:val="1"/>
+      <w:numFmt w:val="lowerRoman"/>
+      <w:lvlText w:val="%9."/>
+      <w:lvlJc w:val="right"/>
+      <w:pPr>
+        <w:ind w:left="6480" w:hanging="180"/>
+      </w:pPr>
+    </w:lvl>
+  </w:abstractNum>
+  <w:abstractNum w:abstractNumId="2" w15:restartNumberingAfterBreak="0">
+    <w:nsid w:val="13F5615E"/>
+    <w:multiLevelType w:val="hybridMultilevel"/>
+    <w:tmpl w:val="208AAE94"/>
+    <w:lvl w:ilvl="0" w:tplc="DFC8A664">
+      <w:start w:val="1"/>
+      <w:numFmt w:val="decimal"/>
+      <w:lvlText w:val="%1."/>
+      <w:lvlJc w:val="left"/>
+      <w:pPr>
+        <w:ind w:left="360" w:hanging="360"/>
+      </w:pPr>
+      <w:rPr>
+        <w:rFonts w:hint="default"/>
+        <w:b/>
+        <w:bCs/>
+      </w:rPr>
+    </w:lvl>
+    <w:lvl w:ilvl="1" w:tplc="04090019" w:tentative="1">
+      <w:start w:val="1"/>
+      <w:numFmt w:val="lowerLetter"/>
+      <w:lvlText w:val="%2."/>
+      <w:lvlJc w:val="left"/>
+      <w:pPr>
+        <w:ind w:left="1080" w:hanging="360"/>
+      </w:pPr>
+    </w:lvl>
+    <w:lvl w:ilvl="2" w:tplc="0409001B" w:tentative="1">
+      <w:start w:val="1"/>
+      <w:numFmt w:val="lowerRoman"/>
+      <w:lvlText w:val="%3."/>
+      <w:lvlJc w:val="right"/>
+      <w:pPr>
+        <w:ind w:left="1800" w:hanging="180"/>
+      </w:pPr>
+    </w:lvl>
+    <w:lvl w:ilvl="3" w:tplc="0409000F" w:tentative="1">
+      <w:start w:val="1"/>
+      <w:numFmt w:val="decimal"/>
+      <w:lvlText w:val="%4."/>
+      <w:lvlJc w:val="left"/>
+      <w:pPr>
+        <w:ind w:left="2520" w:hanging="360"/>
+      </w:pPr>
+    </w:lvl>
+    <w:lvl w:ilvl="4" w:tplc="04090019" w:tentative="1">
+      <w:start w:val="1"/>
+      <w:numFmt w:val="lowerLetter"/>
+      <w:lvlText w:val="%5."/>
+      <w:lvlJc w:val="left"/>
+      <w:pPr>
+        <w:ind w:left="3240" w:hanging="360"/>
+      </w:pPr>
+    </w:lvl>
+    <w:lvl w:ilvl="5" w:tplc="0409001B" w:tentative="1">
+      <w:start w:val="1"/>
+      <w:numFmt w:val="lowerRoman"/>
+      <w:lvlText w:val="%6."/>
+      <w:lvlJc w:val="right"/>
+      <w:pPr>
+        <w:ind w:left="3960" w:hanging="180"/>
+      </w:pPr>
+    </w:lvl>
+    <w:lvl w:ilvl="6" w:tplc="0409000F" w:tentative="1">
+      <w:start w:val="1"/>
+      <w:numFmt w:val="decimal"/>
+      <w:lvlText w:val="%7."/>
+      <w:lvlJc w:val="left"/>
+      <w:pPr>
+        <w:ind w:left="4680" w:hanging="360"/>
+      </w:pPr>
+    </w:lvl>
+    <w:lvl w:ilvl="7" w:tplc="04090019" w:tentative="1">
+      <w:start w:val="1"/>
+      <w:numFmt w:val="lowerLetter"/>
+      <w:lvlText w:val="%8."/>
+      <w:lvlJc w:val="left"/>
+      <w:pPr>
+        <w:ind w:left="5400" w:hanging="360"/>
+      </w:pPr>
+    </w:lvl>
+    <w:lvl w:ilvl="8" w:tplc="0409001B" w:tentative="1">
+      <w:start w:val="1"/>
+      <w:numFmt w:val="lowerRoman"/>
+      <w:lvlText w:val="%9."/>
+      <w:lvlJc w:val="right"/>
+      <w:pPr>
+        <w:ind w:left="6120" w:hanging="180"/>
+      </w:pPr>
+    </w:lvl>
+  </w:abstractNum>
+  <w:abstractNum w:abstractNumId="3" w15:restartNumberingAfterBreak="0">
+    <w:nsid w:val="17BC3076"/>
+    <w:multiLevelType w:val="hybridMultilevel"/>
+    <w:tmpl w:val="BBFEA608"/>
+    <w:lvl w:ilvl="0" w:tplc="04090001">
+      <w:start w:val="1"/>
+      <w:numFmt w:val="bullet"/>
+      <w:lvlText w:val=""/>
+      <w:lvlJc w:val="left"/>
+      <w:pPr>
+        <w:ind w:left="360" w:hanging="360"/>
+      </w:pPr>
+      <w:rPr>
+        <w:rFonts w:ascii="Symbol" w:hAnsi="Symbol" w:hint="default"/>
+      </w:rPr>
+    </w:lvl>
+    <w:lvl w:ilvl="1" w:tplc="04090003" w:tentative="1">
+      <w:start w:val="1"/>
+      <w:numFmt w:val="bullet"/>
+      <w:lvlText w:val="o"/>
+      <w:lvlJc w:val="left"/>
+      <w:pPr>
+        <w:ind w:left="1080" w:hanging="360"/>
+      </w:pPr>
+      <w:rPr>
+        <w:rFonts w:ascii="Courier New" w:hAnsi="Courier New" w:cs="Courier New" w:hint="default"/>
+      </w:rPr>
+    </w:lvl>
+    <w:lvl w:ilvl="2" w:tplc="04090005" w:tentative="1">
+      <w:start w:val="1"/>
+      <w:numFmt w:val="bullet"/>
+      <w:lvlText w:val=""/>
+      <w:lvlJc w:val="left"/>
+      <w:pPr>
+        <w:ind w:left="1800" w:hanging="360"/>
+      </w:pPr>
+      <w:rPr>
+        <w:rFonts w:ascii="Wingdings" w:hAnsi="Wingdings" w:hint="default"/>
+      </w:rPr>
+    </w:lvl>
+    <w:lvl w:ilvl="3" w:tplc="04090001" w:tentative="1">
+      <w:start w:val="1"/>
+      <w:numFmt w:val="bullet"/>
+      <w:lvlText w:val=""/>
+      <w:lvlJc w:val="left"/>
+      <w:pPr>
+        <w:ind w:left="2520" w:hanging="360"/>
+      </w:pPr>
+      <w:rPr>
+        <w:rFonts w:ascii="Symbol" w:hAnsi="Symbol" w:hint="default"/>
+      </w:rPr>
+    </w:lvl>
+    <w:lvl w:ilvl="4" w:tplc="04090003" w:tentative="1">
+      <w:start w:val="1"/>
+      <w:numFmt w:val="bullet"/>
+      <w:lvlText w:val="o"/>
+      <w:lvlJc w:val="left"/>
+      <w:pPr>
+        <w:ind w:left="3240" w:hanging="360"/>
+      </w:pPr>
+      <w:rPr>
+        <w:rFonts w:ascii="Courier New" w:hAnsi="Courier New" w:cs="Courier New" w:hint="default"/>
+      </w:rPr>
+    </w:lvl>
+    <w:lvl w:ilvl="5" w:tplc="04090005" w:tentative="1">
+      <w:start w:val="1"/>
+      <w:numFmt w:val="bullet"/>
+      <w:lvlText w:val=""/>
+      <w:lvlJc w:val="left"/>
+      <w:pPr>
+        <w:ind w:left="3960" w:hanging="360"/>
+      </w:pPr>
+      <w:rPr>
+        <w:rFonts w:ascii="Wingdings" w:hAnsi="Wingdings" w:hint="default"/>
+      </w:rPr>
+    </w:lvl>
+    <w:lvl w:ilvl="6" w:tplc="04090001" w:tentative="1">
+      <w:start w:val="1"/>
+      <w:numFmt w:val="bullet"/>
+      <w:lvlText w:val=""/>
+      <w:lvlJc w:val="left"/>
+      <w:pPr>
+        <w:ind w:left="4680" w:hanging="360"/>
+      </w:pPr>
+      <w:rPr>
+        <w:rFonts w:ascii="Symbol" w:hAnsi="Symbol" w:hint="default"/>
+      </w:rPr>
+    </w:lvl>
+    <w:lvl w:ilvl="7" w:tplc="04090003" w:tentative="1">
+      <w:start w:val="1"/>
+      <w:numFmt w:val="bullet"/>
+      <w:lvlText w:val="o"/>
+      <w:lvlJc w:val="left"/>
+      <w:pPr>
+        <w:ind w:left="5400" w:hanging="360"/>
+      </w:pPr>
+      <w:rPr>
+        <w:rFonts w:ascii="Courier New" w:hAnsi="Courier New" w:cs="Courier New" w:hint="default"/>
+      </w:rPr>
+    </w:lvl>
+    <w:lvl w:ilvl="8" w:tplc="04090005" w:tentative="1">
+      <w:start w:val="1"/>
+      <w:numFmt w:val="bullet"/>
+      <w:lvlText w:val=""/>
+      <w:lvlJc w:val="left"/>
+      <w:pPr>
+        <w:ind w:left="6120" w:hanging="360"/>
+      </w:pPr>
+      <w:rPr>
+        <w:rFonts w:ascii="Wingdings" w:hAnsi="Wingdings" w:hint="default"/>
+      </w:rPr>
+    </w:lvl>
+  </w:abstractNum>
+  <w:abstractNum w:abstractNumId="4" w15:restartNumberingAfterBreak="0">
     <w:nsid w:val="267A58ED"/>
     <w:multiLevelType w:val="hybridMultilevel"/>
     <w:tmpl w:val="7552590A"/>
@@ -3241,7 +4725,7 @@
       </w:rPr>
     </w:lvl>
   </w:abstractNum>
-  <w:abstractNum w:abstractNumId="2" w15:restartNumberingAfterBreak="0">
+  <w:abstractNum w:abstractNumId="5" w15:restartNumberingAfterBreak="0">
     <w:nsid w:val="2BBD2213"/>
     <w:multiLevelType w:val="hybridMultilevel"/>
     <w:tmpl w:val="D428B59A"/>
@@ -3354,7 +4838,120 @@
       </w:rPr>
     </w:lvl>
   </w:abstractNum>
-  <w:abstractNum w:abstractNumId="3" w15:restartNumberingAfterBreak="0">
+  <w:abstractNum w:abstractNumId="6" w15:restartNumberingAfterBreak="0">
+    <w:nsid w:val="4948195A"/>
+    <w:multiLevelType w:val="hybridMultilevel"/>
+    <w:tmpl w:val="A48AB2B2"/>
+    <w:lvl w:ilvl="0" w:tplc="04090001">
+      <w:start w:val="1"/>
+      <w:numFmt w:val="bullet"/>
+      <w:lvlText w:val=""/>
+      <w:lvlJc w:val="left"/>
+      <w:pPr>
+        <w:ind w:left="720" w:hanging="360"/>
+      </w:pPr>
+      <w:rPr>
+        <w:rFonts w:ascii="Symbol" w:hAnsi="Symbol" w:hint="default"/>
+      </w:rPr>
+    </w:lvl>
+    <w:lvl w:ilvl="1" w:tplc="04090003" w:tentative="1">
+      <w:start w:val="1"/>
+      <w:numFmt w:val="bullet"/>
+      <w:lvlText w:val="o"/>
+      <w:lvlJc w:val="left"/>
+      <w:pPr>
+        <w:ind w:left="1440" w:hanging="360"/>
+      </w:pPr>
+      <w:rPr>
+        <w:rFonts w:ascii="Courier New" w:hAnsi="Courier New" w:cs="Courier New" w:hint="default"/>
+      </w:rPr>
+    </w:lvl>
+    <w:lvl w:ilvl="2" w:tplc="04090005" w:tentative="1">
+      <w:start w:val="1"/>
+      <w:numFmt w:val="bullet"/>
+      <w:lvlText w:val=""/>
+      <w:lvlJc w:val="left"/>
+      <w:pPr>
+        <w:ind w:left="2160" w:hanging="360"/>
+      </w:pPr>
+      <w:rPr>
+        <w:rFonts w:ascii="Wingdings" w:hAnsi="Wingdings" w:hint="default"/>
+      </w:rPr>
+    </w:lvl>
+    <w:lvl w:ilvl="3" w:tplc="04090001" w:tentative="1">
+      <w:start w:val="1"/>
+      <w:numFmt w:val="bullet"/>
+      <w:lvlText w:val=""/>
+      <w:lvlJc w:val="left"/>
+      <w:pPr>
+        <w:ind w:left="2880" w:hanging="360"/>
+      </w:pPr>
+      <w:rPr>
+        <w:rFonts w:ascii="Symbol" w:hAnsi="Symbol" w:hint="default"/>
+      </w:rPr>
+    </w:lvl>
+    <w:lvl w:ilvl="4" w:tplc="04090003" w:tentative="1">
+      <w:start w:val="1"/>
+      <w:numFmt w:val="bullet"/>
+      <w:lvlText w:val="o"/>
+      <w:lvlJc w:val="left"/>
+      <w:pPr>
+        <w:ind w:left="3600" w:hanging="360"/>
+      </w:pPr>
+      <w:rPr>
+        <w:rFonts w:ascii="Courier New" w:hAnsi="Courier New" w:cs="Courier New" w:hint="default"/>
+      </w:rPr>
+    </w:lvl>
+    <w:lvl w:ilvl="5" w:tplc="04090005" w:tentative="1">
+      <w:start w:val="1"/>
+      <w:numFmt w:val="bullet"/>
+      <w:lvlText w:val=""/>
+      <w:lvlJc w:val="left"/>
+      <w:pPr>
+        <w:ind w:left="4320" w:hanging="360"/>
+      </w:pPr>
+      <w:rPr>
+        <w:rFonts w:ascii="Wingdings" w:hAnsi="Wingdings" w:hint="default"/>
+      </w:rPr>
+    </w:lvl>
+    <w:lvl w:ilvl="6" w:tplc="04090001" w:tentative="1">
+      <w:start w:val="1"/>
+      <w:numFmt w:val="bullet"/>
+      <w:lvlText w:val=""/>
+      <w:lvlJc w:val="left"/>
+      <w:pPr>
+        <w:ind w:left="5040" w:hanging="360"/>
+      </w:pPr>
+      <w:rPr>
+        <w:rFonts w:ascii="Symbol" w:hAnsi="Symbol" w:hint="default"/>
+      </w:rPr>
+    </w:lvl>
+    <w:lvl w:ilvl="7" w:tplc="04090003" w:tentative="1">
+      <w:start w:val="1"/>
+      <w:numFmt w:val="bullet"/>
+      <w:lvlText w:val="o"/>
+      <w:lvlJc w:val="left"/>
+      <w:pPr>
+        <w:ind w:left="5760" w:hanging="360"/>
+      </w:pPr>
+      <w:rPr>
+        <w:rFonts w:ascii="Courier New" w:hAnsi="Courier New" w:cs="Courier New" w:hint="default"/>
+      </w:rPr>
+    </w:lvl>
+    <w:lvl w:ilvl="8" w:tplc="04090005" w:tentative="1">
+      <w:start w:val="1"/>
+      <w:numFmt w:val="bullet"/>
+      <w:lvlText w:val=""/>
+      <w:lvlJc w:val="left"/>
+      <w:pPr>
+        <w:ind w:left="6480" w:hanging="360"/>
+      </w:pPr>
+      <w:rPr>
+        <w:rFonts w:ascii="Wingdings" w:hAnsi="Wingdings" w:hint="default"/>
+      </w:rPr>
+    </w:lvl>
+  </w:abstractNum>
+  <w:abstractNum w:abstractNumId="7" w15:restartNumberingAfterBreak="0">
     <w:nsid w:val="53F1056B"/>
     <w:multiLevelType w:val="hybridMultilevel"/>
     <w:tmpl w:val="356CDA44"/>
@@ -3467,17 +5064,239 @@
       </w:rPr>
     </w:lvl>
   </w:abstractNum>
+  <w:abstractNum w:abstractNumId="8" w15:restartNumberingAfterBreak="0">
+    <w:nsid w:val="56C626BD"/>
+    <w:multiLevelType w:val="hybridMultilevel"/>
+    <w:tmpl w:val="D3F85BEA"/>
+    <w:lvl w:ilvl="0" w:tplc="04090001">
+      <w:start w:val="1"/>
+      <w:numFmt w:val="bullet"/>
+      <w:lvlText w:val=""/>
+      <w:lvlJc w:val="left"/>
+      <w:pPr>
+        <w:ind w:left="360" w:hanging="360"/>
+      </w:pPr>
+      <w:rPr>
+        <w:rFonts w:ascii="Symbol" w:hAnsi="Symbol" w:hint="default"/>
+      </w:rPr>
+    </w:lvl>
+    <w:lvl w:ilvl="1" w:tplc="04090003" w:tentative="1">
+      <w:start w:val="1"/>
+      <w:numFmt w:val="bullet"/>
+      <w:lvlText w:val="o"/>
+      <w:lvlJc w:val="left"/>
+      <w:pPr>
+        <w:ind w:left="1080" w:hanging="360"/>
+      </w:pPr>
+      <w:rPr>
+        <w:rFonts w:ascii="Courier New" w:hAnsi="Courier New" w:cs="Courier New" w:hint="default"/>
+      </w:rPr>
+    </w:lvl>
+    <w:lvl w:ilvl="2" w:tplc="04090005" w:tentative="1">
+      <w:start w:val="1"/>
+      <w:numFmt w:val="bullet"/>
+      <w:lvlText w:val=""/>
+      <w:lvlJc w:val="left"/>
+      <w:pPr>
+        <w:ind w:left="1800" w:hanging="360"/>
+      </w:pPr>
+      <w:rPr>
+        <w:rFonts w:ascii="Wingdings" w:hAnsi="Wingdings" w:hint="default"/>
+      </w:rPr>
+    </w:lvl>
+    <w:lvl w:ilvl="3" w:tplc="04090001" w:tentative="1">
+      <w:start w:val="1"/>
+      <w:numFmt w:val="bullet"/>
+      <w:lvlText w:val=""/>
+      <w:lvlJc w:val="left"/>
+      <w:pPr>
+        <w:ind w:left="2520" w:hanging="360"/>
+      </w:pPr>
+      <w:rPr>
+        <w:rFonts w:ascii="Symbol" w:hAnsi="Symbol" w:hint="default"/>
+      </w:rPr>
+    </w:lvl>
+    <w:lvl w:ilvl="4" w:tplc="04090003" w:tentative="1">
+      <w:start w:val="1"/>
+      <w:numFmt w:val="bullet"/>
+      <w:lvlText w:val="o"/>
+      <w:lvlJc w:val="left"/>
+      <w:pPr>
+        <w:ind w:left="3240" w:hanging="360"/>
+      </w:pPr>
+      <w:rPr>
+        <w:rFonts w:ascii="Courier New" w:hAnsi="Courier New" w:cs="Courier New" w:hint="default"/>
+      </w:rPr>
+    </w:lvl>
+    <w:lvl w:ilvl="5" w:tplc="04090005" w:tentative="1">
+      <w:start w:val="1"/>
+      <w:numFmt w:val="bullet"/>
+      <w:lvlText w:val=""/>
+      <w:lvlJc w:val="left"/>
+      <w:pPr>
+        <w:ind w:left="3960" w:hanging="360"/>
+      </w:pPr>
+      <w:rPr>
+        <w:rFonts w:ascii="Wingdings" w:hAnsi="Wingdings" w:hint="default"/>
+      </w:rPr>
+    </w:lvl>
+    <w:lvl w:ilvl="6" w:tplc="04090001" w:tentative="1">
+      <w:start w:val="1"/>
+      <w:numFmt w:val="bullet"/>
+      <w:lvlText w:val=""/>
+      <w:lvlJc w:val="left"/>
+      <w:pPr>
+        <w:ind w:left="4680" w:hanging="360"/>
+      </w:pPr>
+      <w:rPr>
+        <w:rFonts w:ascii="Symbol" w:hAnsi="Symbol" w:hint="default"/>
+      </w:rPr>
+    </w:lvl>
+    <w:lvl w:ilvl="7" w:tplc="04090003" w:tentative="1">
+      <w:start w:val="1"/>
+      <w:numFmt w:val="bullet"/>
+      <w:lvlText w:val="o"/>
+      <w:lvlJc w:val="left"/>
+      <w:pPr>
+        <w:ind w:left="5400" w:hanging="360"/>
+      </w:pPr>
+      <w:rPr>
+        <w:rFonts w:ascii="Courier New" w:hAnsi="Courier New" w:cs="Courier New" w:hint="default"/>
+      </w:rPr>
+    </w:lvl>
+    <w:lvl w:ilvl="8" w:tplc="04090005" w:tentative="1">
+      <w:start w:val="1"/>
+      <w:numFmt w:val="bullet"/>
+      <w:lvlText w:val=""/>
+      <w:lvlJc w:val="left"/>
+      <w:pPr>
+        <w:ind w:left="6120" w:hanging="360"/>
+      </w:pPr>
+      <w:rPr>
+        <w:rFonts w:ascii="Wingdings" w:hAnsi="Wingdings" w:hint="default"/>
+      </w:rPr>
+    </w:lvl>
+  </w:abstractNum>
+  <w:abstractNum w:abstractNumId="9" w15:restartNumberingAfterBreak="0">
+    <w:nsid w:val="57117ED2"/>
+    <w:multiLevelType w:val="hybridMultilevel"/>
+    <w:tmpl w:val="13CE1BAA"/>
+    <w:lvl w:ilvl="0" w:tplc="DFC8A664">
+      <w:start w:val="1"/>
+      <w:numFmt w:val="decimal"/>
+      <w:lvlText w:val="%1."/>
+      <w:lvlJc w:val="left"/>
+      <w:pPr>
+        <w:ind w:left="360" w:hanging="360"/>
+      </w:pPr>
+      <w:rPr>
+        <w:rFonts w:hint="default"/>
+        <w:b/>
+        <w:bCs/>
+      </w:rPr>
+    </w:lvl>
+    <w:lvl w:ilvl="1" w:tplc="04090019" w:tentative="1">
+      <w:start w:val="1"/>
+      <w:numFmt w:val="lowerLetter"/>
+      <w:lvlText w:val="%2."/>
+      <w:lvlJc w:val="left"/>
+      <w:pPr>
+        <w:ind w:left="1440" w:hanging="360"/>
+      </w:pPr>
+    </w:lvl>
+    <w:lvl w:ilvl="2" w:tplc="0409001B" w:tentative="1">
+      <w:start w:val="1"/>
+      <w:numFmt w:val="lowerRoman"/>
+      <w:lvlText w:val="%3."/>
+      <w:lvlJc w:val="right"/>
+      <w:pPr>
+        <w:ind w:left="2160" w:hanging="180"/>
+      </w:pPr>
+    </w:lvl>
+    <w:lvl w:ilvl="3" w:tplc="0409000F" w:tentative="1">
+      <w:start w:val="1"/>
+      <w:numFmt w:val="decimal"/>
+      <w:lvlText w:val="%4."/>
+      <w:lvlJc w:val="left"/>
+      <w:pPr>
+        <w:ind w:left="2880" w:hanging="360"/>
+      </w:pPr>
+    </w:lvl>
+    <w:lvl w:ilvl="4" w:tplc="04090019" w:tentative="1">
+      <w:start w:val="1"/>
+      <w:numFmt w:val="lowerLetter"/>
+      <w:lvlText w:val="%5."/>
+      <w:lvlJc w:val="left"/>
+      <w:pPr>
+        <w:ind w:left="3600" w:hanging="360"/>
+      </w:pPr>
+    </w:lvl>
+    <w:lvl w:ilvl="5" w:tplc="0409001B" w:tentative="1">
+      <w:start w:val="1"/>
+      <w:numFmt w:val="lowerRoman"/>
+      <w:lvlText w:val="%6."/>
+      <w:lvlJc w:val="right"/>
+      <w:pPr>
+        <w:ind w:left="4320" w:hanging="180"/>
+      </w:pPr>
+    </w:lvl>
+    <w:lvl w:ilvl="6" w:tplc="0409000F" w:tentative="1">
+      <w:start w:val="1"/>
+      <w:numFmt w:val="decimal"/>
+      <w:lvlText w:val="%7."/>
+      <w:lvlJc w:val="left"/>
+      <w:pPr>
+        <w:ind w:left="5040" w:hanging="360"/>
+      </w:pPr>
+    </w:lvl>
+    <w:lvl w:ilvl="7" w:tplc="04090019" w:tentative="1">
+      <w:start w:val="1"/>
+      <w:numFmt w:val="lowerLetter"/>
+      <w:lvlText w:val="%8."/>
+      <w:lvlJc w:val="left"/>
+      <w:pPr>
+        <w:ind w:left="5760" w:hanging="360"/>
+      </w:pPr>
+    </w:lvl>
+    <w:lvl w:ilvl="8" w:tplc="0409001B" w:tentative="1">
+      <w:start w:val="1"/>
+      <w:numFmt w:val="lowerRoman"/>
+      <w:lvlText w:val="%9."/>
+      <w:lvlJc w:val="right"/>
+      <w:pPr>
+        <w:ind w:left="6480" w:hanging="180"/>
+      </w:pPr>
+    </w:lvl>
+  </w:abstractNum>
   <w:num w:numId="1" w16cid:durableId="295065336">
-    <w:abstractNumId w:val="2"/>
+    <w:abstractNumId w:val="5"/>
   </w:num>
   <w:num w:numId="2" w16cid:durableId="23798700">
-    <w:abstractNumId w:val="1"/>
+    <w:abstractNumId w:val="4"/>
   </w:num>
   <w:num w:numId="3" w16cid:durableId="1226989035">
-    <w:abstractNumId w:val="3"/>
+    <w:abstractNumId w:val="7"/>
   </w:num>
   <w:num w:numId="4" w16cid:durableId="1415854787">
     <w:abstractNumId w:val="0"/>
+  </w:num>
+  <w:num w:numId="5" w16cid:durableId="790705829">
+    <w:abstractNumId w:val="2"/>
+  </w:num>
+  <w:num w:numId="6" w16cid:durableId="333846032">
+    <w:abstractNumId w:val="3"/>
+  </w:num>
+  <w:num w:numId="7" w16cid:durableId="1506750727">
+    <w:abstractNumId w:val="1"/>
+  </w:num>
+  <w:num w:numId="8" w16cid:durableId="1858999188">
+    <w:abstractNumId w:val="6"/>
+  </w:num>
+  <w:num w:numId="9" w16cid:durableId="1914385937">
+    <w:abstractNumId w:val="9"/>
+  </w:num>
+  <w:num w:numId="10" w16cid:durableId="1519007689">
+    <w:abstractNumId w:val="8"/>
   </w:num>
 </w:numbering>
 </file>
@@ -4442,6 +6261,188 @@
     <w:uiPriority w:val="99"/>
     <w:rsid w:val="00380BCE"/>
   </w:style>
+  <w:style w:type="table" w:styleId="GridTable5Dark">
+    <w:name w:val="Grid Table 5 Dark"/>
+    <w:basedOn w:val="TableNormal"/>
+    <w:uiPriority w:val="50"/>
+    <w:rsid w:val="00D3631D"/>
+    <w:pPr>
+      <w:spacing w:after="0" w:line="240" w:lineRule="auto"/>
+    </w:pPr>
+    <w:tblPr>
+      <w:tblStyleRowBandSize w:val="1"/>
+      <w:tblStyleColBandSize w:val="1"/>
+      <w:tblBorders>
+        <w:top w:val="single" w:sz="4" w:space="0" w:color="FFFFFF" w:themeColor="background1"/>
+        <w:left w:val="single" w:sz="4" w:space="0" w:color="FFFFFF" w:themeColor="background1"/>
+        <w:bottom w:val="single" w:sz="4" w:space="0" w:color="FFFFFF" w:themeColor="background1"/>
+        <w:right w:val="single" w:sz="4" w:space="0" w:color="FFFFFF" w:themeColor="background1"/>
+        <w:insideH w:val="single" w:sz="4" w:space="0" w:color="FFFFFF" w:themeColor="background1"/>
+        <w:insideV w:val="single" w:sz="4" w:space="0" w:color="FFFFFF" w:themeColor="background1"/>
+      </w:tblBorders>
+    </w:tblPr>
+    <w:tcPr>
+      <w:shd w:val="clear" w:color="auto" w:fill="CCCCCC" w:themeFill="text1" w:themeFillTint="33"/>
+    </w:tcPr>
+    <w:tblStylePr w:type="firstRow">
+      <w:rPr>
+        <w:b/>
+        <w:bCs/>
+        <w:color w:val="FFFFFF" w:themeColor="background1"/>
+      </w:rPr>
+      <w:tblPr/>
+      <w:tcPr>
+        <w:tcBorders>
+          <w:top w:val="single" w:sz="4" w:space="0" w:color="FFFFFF" w:themeColor="background1"/>
+          <w:left w:val="single" w:sz="4" w:space="0" w:color="FFFFFF" w:themeColor="background1"/>
+          <w:right w:val="single" w:sz="4" w:space="0" w:color="FFFFFF" w:themeColor="background1"/>
+          <w:insideH w:val="nil"/>
+          <w:insideV w:val="nil"/>
+        </w:tcBorders>
+        <w:shd w:val="clear" w:color="auto" w:fill="000000" w:themeFill="text1"/>
+      </w:tcPr>
+    </w:tblStylePr>
+    <w:tblStylePr w:type="lastRow">
+      <w:rPr>
+        <w:b/>
+        <w:bCs/>
+        <w:color w:val="FFFFFF" w:themeColor="background1"/>
+      </w:rPr>
+      <w:tblPr/>
+      <w:tcPr>
+        <w:tcBorders>
+          <w:left w:val="single" w:sz="4" w:space="0" w:color="FFFFFF" w:themeColor="background1"/>
+          <w:bottom w:val="single" w:sz="4" w:space="0" w:color="FFFFFF" w:themeColor="background1"/>
+          <w:right w:val="single" w:sz="4" w:space="0" w:color="FFFFFF" w:themeColor="background1"/>
+          <w:insideH w:val="nil"/>
+          <w:insideV w:val="nil"/>
+        </w:tcBorders>
+        <w:shd w:val="clear" w:color="auto" w:fill="000000" w:themeFill="text1"/>
+      </w:tcPr>
+    </w:tblStylePr>
+    <w:tblStylePr w:type="firstCol">
+      <w:rPr>
+        <w:b/>
+        <w:bCs/>
+        <w:color w:val="FFFFFF" w:themeColor="background1"/>
+      </w:rPr>
+      <w:tblPr/>
+      <w:tcPr>
+        <w:tcBorders>
+          <w:top w:val="single" w:sz="4" w:space="0" w:color="FFFFFF" w:themeColor="background1"/>
+          <w:left w:val="single" w:sz="4" w:space="0" w:color="FFFFFF" w:themeColor="background1"/>
+          <w:bottom w:val="single" w:sz="4" w:space="0" w:color="FFFFFF" w:themeColor="background1"/>
+          <w:insideV w:val="nil"/>
+        </w:tcBorders>
+        <w:shd w:val="clear" w:color="auto" w:fill="000000" w:themeFill="text1"/>
+      </w:tcPr>
+    </w:tblStylePr>
+    <w:tblStylePr w:type="lastCol">
+      <w:rPr>
+        <w:b/>
+        <w:bCs/>
+        <w:color w:val="FFFFFF" w:themeColor="background1"/>
+      </w:rPr>
+      <w:tblPr/>
+      <w:tcPr>
+        <w:tcBorders>
+          <w:top w:val="single" w:sz="4" w:space="0" w:color="FFFFFF" w:themeColor="background1"/>
+          <w:bottom w:val="single" w:sz="4" w:space="0" w:color="FFFFFF" w:themeColor="background1"/>
+          <w:right w:val="single" w:sz="4" w:space="0" w:color="FFFFFF" w:themeColor="background1"/>
+          <w:insideV w:val="nil"/>
+        </w:tcBorders>
+        <w:shd w:val="clear" w:color="auto" w:fill="000000" w:themeFill="text1"/>
+      </w:tcPr>
+    </w:tblStylePr>
+    <w:tblStylePr w:type="band1Vert">
+      <w:tblPr/>
+      <w:tcPr>
+        <w:shd w:val="clear" w:color="auto" w:fill="999999" w:themeFill="text1" w:themeFillTint="66"/>
+      </w:tcPr>
+    </w:tblStylePr>
+    <w:tblStylePr w:type="band1Horz">
+      <w:tblPr/>
+      <w:tcPr>
+        <w:shd w:val="clear" w:color="auto" w:fill="999999" w:themeFill="text1" w:themeFillTint="66"/>
+      </w:tcPr>
+    </w:tblStylePr>
+  </w:style>
+  <w:style w:type="table" w:styleId="GridTable4">
+    <w:name w:val="Grid Table 4"/>
+    <w:basedOn w:val="TableNormal"/>
+    <w:uiPriority w:val="49"/>
+    <w:rsid w:val="00D3631D"/>
+    <w:pPr>
+      <w:spacing w:after="0" w:line="240" w:lineRule="auto"/>
+    </w:pPr>
+    <w:tblPr>
+      <w:tblStyleRowBandSize w:val="1"/>
+      <w:tblStyleColBandSize w:val="1"/>
+      <w:tblBorders>
+        <w:top w:val="single" w:sz="4" w:space="0" w:color="666666" w:themeColor="text1" w:themeTint="99"/>
+        <w:left w:val="single" w:sz="4" w:space="0" w:color="666666" w:themeColor="text1" w:themeTint="99"/>
+        <w:bottom w:val="single" w:sz="4" w:space="0" w:color="666666" w:themeColor="text1" w:themeTint="99"/>
+        <w:right w:val="single" w:sz="4" w:space="0" w:color="666666" w:themeColor="text1" w:themeTint="99"/>
+        <w:insideH w:val="single" w:sz="4" w:space="0" w:color="666666" w:themeColor="text1" w:themeTint="99"/>
+        <w:insideV w:val="single" w:sz="4" w:space="0" w:color="666666" w:themeColor="text1" w:themeTint="99"/>
+      </w:tblBorders>
+    </w:tblPr>
+    <w:tblStylePr w:type="firstRow">
+      <w:rPr>
+        <w:b/>
+        <w:bCs/>
+        <w:color w:val="FFFFFF" w:themeColor="background1"/>
+      </w:rPr>
+      <w:tblPr/>
+      <w:tcPr>
+        <w:tcBorders>
+          <w:top w:val="single" w:sz="4" w:space="0" w:color="000000" w:themeColor="text1"/>
+          <w:left w:val="single" w:sz="4" w:space="0" w:color="000000" w:themeColor="text1"/>
+          <w:bottom w:val="single" w:sz="4" w:space="0" w:color="000000" w:themeColor="text1"/>
+          <w:right w:val="single" w:sz="4" w:space="0" w:color="000000" w:themeColor="text1"/>
+          <w:insideH w:val="nil"/>
+          <w:insideV w:val="nil"/>
+        </w:tcBorders>
+        <w:shd w:val="clear" w:color="auto" w:fill="000000" w:themeFill="text1"/>
+      </w:tcPr>
+    </w:tblStylePr>
+    <w:tblStylePr w:type="lastRow">
+      <w:rPr>
+        <w:b/>
+        <w:bCs/>
+      </w:rPr>
+      <w:tblPr/>
+      <w:tcPr>
+        <w:tcBorders>
+          <w:top w:val="double" w:sz="4" w:space="0" w:color="000000" w:themeColor="text1"/>
+        </w:tcBorders>
+      </w:tcPr>
+    </w:tblStylePr>
+    <w:tblStylePr w:type="firstCol">
+      <w:rPr>
+        <w:b/>
+        <w:bCs/>
+      </w:rPr>
+    </w:tblStylePr>
+    <w:tblStylePr w:type="lastCol">
+      <w:rPr>
+        <w:b/>
+        <w:bCs/>
+      </w:rPr>
+    </w:tblStylePr>
+    <w:tblStylePr w:type="band1Vert">
+      <w:tblPr/>
+      <w:tcPr>
+        <w:shd w:val="clear" w:color="auto" w:fill="CCCCCC" w:themeFill="text1" w:themeFillTint="33"/>
+      </w:tcPr>
+    </w:tblStylePr>
+    <w:tblStylePr w:type="band1Horz">
+      <w:tblPr/>
+      <w:tcPr>
+        <w:shd w:val="clear" w:color="auto" w:fill="CCCCCC" w:themeFill="text1" w:themeFillTint="33"/>
+      </w:tcPr>
+    </w:tblStylePr>
+  </w:style>
 </w:styles>
 </file>
 

</xml_diff>